<commit_message>
Production Register shows the source of each policy (Migrated or BrokerVerse) and groups by it
</commit_message>
<xml_diff>
--- a/docs/package/04_Onboarding_and_Go_Live/BrokerVerse_Environment_Strategy_and_Production_Rollout.docx
+++ b/docs/package/04_Onboarding_and_Go_Live/BrokerVerse_Environment_Strategy_and_Production_Rollout.docx
@@ -789,7 +789,7 @@
             </w:rPr>
             <w:fldChar w:fldCharType="separate"/>
           </w:r>
-          <w:hyperlink w:anchor="__RefHeading___Toc7749_1830364081">
+          <w:hyperlink w:anchor="__RefHeading___Toc7727_3302175133">
             <w:r>
               <w:rPr>
                 <w:webHidden/>
@@ -824,7 +824,7 @@
             </w:tabs>
             <w:rPr/>
           </w:pPr>
-          <w:hyperlink w:anchor="__RefHeading___Toc7751_1830364081">
+          <w:hyperlink w:anchor="__RefHeading___Toc7729_3302175133">
             <w:r>
               <w:rPr>
                 <w:webHidden/>
@@ -853,7 +853,7 @@
             </w:tabs>
             <w:rPr/>
           </w:pPr>
-          <w:hyperlink w:anchor="__RefHeading___Toc7753_1830364081">
+          <w:hyperlink w:anchor="__RefHeading___Toc7731_3302175133">
             <w:r>
               <w:rPr>
                 <w:webHidden/>
@@ -875,7 +875,7 @@
             </w:tabs>
             <w:rPr/>
           </w:pPr>
-          <w:hyperlink w:anchor="__RefHeading___Toc7755_1830364081">
+          <w:hyperlink w:anchor="__RefHeading___Toc7733_3302175133">
             <w:r>
               <w:rPr>
                 <w:webHidden/>
@@ -897,7 +897,7 @@
             </w:tabs>
             <w:rPr/>
           </w:pPr>
-          <w:hyperlink w:anchor="__RefHeading___Toc7757_1830364081">
+          <w:hyperlink w:anchor="__RefHeading___Toc7735_3302175133">
             <w:r>
               <w:rPr>
                 <w:webHidden/>
@@ -919,7 +919,7 @@
             </w:tabs>
             <w:rPr/>
           </w:pPr>
-          <w:hyperlink w:anchor="__RefHeading___Toc7759_1830364081">
+          <w:hyperlink w:anchor="__RefHeading___Toc7737_3302175133">
             <w:r>
               <w:rPr>
                 <w:webHidden/>
@@ -941,7 +941,7 @@
             </w:tabs>
             <w:rPr/>
           </w:pPr>
-          <w:hyperlink w:anchor="__RefHeading___Toc7761_1830364081">
+          <w:hyperlink w:anchor="__RefHeading___Toc7739_3302175133">
             <w:r>
               <w:rPr>
                 <w:webHidden/>
@@ -963,7 +963,7 @@
             </w:tabs>
             <w:rPr/>
           </w:pPr>
-          <w:hyperlink w:anchor="__RefHeading___Toc7763_1830364081">
+          <w:hyperlink w:anchor="__RefHeading___Toc7741_3302175133">
             <w:r>
               <w:rPr>
                 <w:webHidden/>
@@ -985,7 +985,7 @@
             </w:tabs>
             <w:rPr/>
           </w:pPr>
-          <w:hyperlink w:anchor="__RefHeading___Toc7765_1830364081">
+          <w:hyperlink w:anchor="__RefHeading___Toc7743_3302175133">
             <w:r>
               <w:rPr>
                 <w:webHidden/>
@@ -1007,7 +1007,7 @@
             </w:tabs>
             <w:rPr/>
           </w:pPr>
-          <w:hyperlink w:anchor="__RefHeading___Toc7767_1830364081">
+          <w:hyperlink w:anchor="__RefHeading___Toc7745_3302175133">
             <w:r>
               <w:rPr>
                 <w:webHidden/>
@@ -1029,7 +1029,7 @@
             </w:tabs>
             <w:rPr/>
           </w:pPr>
-          <w:hyperlink w:anchor="__RefHeading___Toc7769_1830364081">
+          <w:hyperlink w:anchor="__RefHeading___Toc7747_3302175133">
             <w:r>
               <w:rPr>
                 <w:webHidden/>
@@ -1051,7 +1051,7 @@
             </w:tabs>
             <w:rPr/>
           </w:pPr>
-          <w:hyperlink w:anchor="__RefHeading___Toc7771_1830364081">
+          <w:hyperlink w:anchor="__RefHeading___Toc7749_3302175133">
             <w:r>
               <w:rPr>
                 <w:webHidden/>
@@ -1073,7 +1073,7 @@
             </w:tabs>
             <w:rPr/>
           </w:pPr>
-          <w:hyperlink w:anchor="__RefHeading___Toc7773_1830364081">
+          <w:hyperlink w:anchor="__RefHeading___Toc7751_3302175133">
             <w:r>
               <w:rPr>
                 <w:webHidden/>
@@ -1095,7 +1095,7 @@
             </w:tabs>
             <w:rPr/>
           </w:pPr>
-          <w:hyperlink w:anchor="__RefHeading___Toc7775_1830364081">
+          <w:hyperlink w:anchor="__RefHeading___Toc7753_3302175133">
             <w:r>
               <w:rPr>
                 <w:webHidden/>
@@ -1117,7 +1117,7 @@
             </w:tabs>
             <w:rPr/>
           </w:pPr>
-          <w:hyperlink w:anchor="__RefHeading___Toc7777_1830364081">
+          <w:hyperlink w:anchor="__RefHeading___Toc7755_3302175133">
             <w:r>
               <w:rPr>
                 <w:webHidden/>
@@ -1139,7 +1139,7 @@
             </w:tabs>
             <w:rPr/>
           </w:pPr>
-          <w:hyperlink w:anchor="__RefHeading___Toc7779_1830364081">
+          <w:hyperlink w:anchor="__RefHeading___Toc7757_3302175133">
             <w:r>
               <w:rPr>
                 <w:webHidden/>
@@ -1161,7 +1161,7 @@
             </w:tabs>
             <w:rPr/>
           </w:pPr>
-          <w:hyperlink w:anchor="__RefHeading___Toc7781_1830364081">
+          <w:hyperlink w:anchor="__RefHeading___Toc7759_3302175133">
             <w:r>
               <w:rPr>
                 <w:webHidden/>
@@ -1183,7 +1183,7 @@
             </w:tabs>
             <w:rPr/>
           </w:pPr>
-          <w:hyperlink w:anchor="__RefHeading___Toc7783_1830364081">
+          <w:hyperlink w:anchor="__RefHeading___Toc7761_3302175133">
             <w:r>
               <w:rPr>
                 <w:webHidden/>
@@ -1205,7 +1205,7 @@
             </w:tabs>
             <w:rPr/>
           </w:pPr>
-          <w:hyperlink w:anchor="__RefHeading___Toc7785_1830364081">
+          <w:hyperlink w:anchor="__RefHeading___Toc7763_3302175133">
             <w:r>
               <w:rPr>
                 <w:webHidden/>
@@ -1227,7 +1227,7 @@
             </w:tabs>
             <w:rPr/>
           </w:pPr>
-          <w:hyperlink w:anchor="__RefHeading___Toc7787_1830364081">
+          <w:hyperlink w:anchor="__RefHeading___Toc7765_3302175133">
             <w:r>
               <w:rPr>
                 <w:webHidden/>
@@ -1249,7 +1249,7 @@
             </w:tabs>
             <w:rPr/>
           </w:pPr>
-          <w:hyperlink w:anchor="__RefHeading___Toc7789_1830364081">
+          <w:hyperlink w:anchor="__RefHeading___Toc7767_3302175133">
             <w:r>
               <w:rPr>
                 <w:webHidden/>
@@ -1271,7 +1271,7 @@
             </w:tabs>
             <w:rPr/>
           </w:pPr>
-          <w:hyperlink w:anchor="__RefHeading___Toc7791_1830364081">
+          <w:hyperlink w:anchor="__RefHeading___Toc7769_3302175133">
             <w:r>
               <w:rPr>
                 <w:webHidden/>
@@ -1293,7 +1293,7 @@
             </w:tabs>
             <w:rPr/>
           </w:pPr>
-          <w:hyperlink w:anchor="__RefHeading___Toc7793_1830364081">
+          <w:hyperlink w:anchor="__RefHeading___Toc7771_3302175133">
             <w:r>
               <w:rPr>
                 <w:webHidden/>
@@ -1315,7 +1315,7 @@
             </w:tabs>
             <w:rPr/>
           </w:pPr>
-          <w:hyperlink w:anchor="__RefHeading___Toc7795_1830364081">
+          <w:hyperlink w:anchor="__RefHeading___Toc7773_3302175133">
             <w:r>
               <w:rPr>
                 <w:webHidden/>
@@ -1337,7 +1337,7 @@
             </w:tabs>
             <w:rPr/>
           </w:pPr>
-          <w:hyperlink w:anchor="__RefHeading___Toc7797_1830364081">
+          <w:hyperlink w:anchor="__RefHeading___Toc7775_3302175133">
             <w:r>
               <w:rPr>
                 <w:webHidden/>
@@ -1359,7 +1359,7 @@
             </w:tabs>
             <w:rPr/>
           </w:pPr>
-          <w:hyperlink w:anchor="__RefHeading___Toc7799_1830364081">
+          <w:hyperlink w:anchor="__RefHeading___Toc7777_3302175133">
             <w:r>
               <w:rPr>
                 <w:webHidden/>
@@ -1381,7 +1381,7 @@
             </w:tabs>
             <w:rPr/>
           </w:pPr>
-          <w:hyperlink w:anchor="__RefHeading___Toc7801_1830364081">
+          <w:hyperlink w:anchor="__RefHeading___Toc7779_3302175133">
             <w:r>
               <w:rPr>
                 <w:webHidden/>
@@ -1403,7 +1403,7 @@
             </w:tabs>
             <w:rPr/>
           </w:pPr>
-          <w:hyperlink w:anchor="__RefHeading___Toc7803_1830364081">
+          <w:hyperlink w:anchor="__RefHeading___Toc7781_3302175133">
             <w:r>
               <w:rPr>
                 <w:webHidden/>
@@ -1425,7 +1425,7 @@
             </w:tabs>
             <w:rPr/>
           </w:pPr>
-          <w:hyperlink w:anchor="__RefHeading___Toc7805_1830364081">
+          <w:hyperlink w:anchor="__RefHeading___Toc7783_3302175133">
             <w:r>
               <w:rPr>
                 <w:webHidden/>
@@ -1447,7 +1447,7 @@
             </w:tabs>
             <w:rPr/>
           </w:pPr>
-          <w:hyperlink w:anchor="__RefHeading___Toc7807_1830364081">
+          <w:hyperlink w:anchor="__RefHeading___Toc7785_3302175133">
             <w:r>
               <w:rPr>
                 <w:webHidden/>
@@ -1469,7 +1469,7 @@
             </w:tabs>
             <w:rPr/>
           </w:pPr>
-          <w:hyperlink w:anchor="__RefHeading___Toc7809_1830364081">
+          <w:hyperlink w:anchor="__RefHeading___Toc7787_3302175133">
             <w:r>
               <w:rPr>
                 <w:webHidden/>
@@ -1491,7 +1491,7 @@
             </w:tabs>
             <w:rPr/>
           </w:pPr>
-          <w:hyperlink w:anchor="__RefHeading___Toc7811_1830364081">
+          <w:hyperlink w:anchor="__RefHeading___Toc7789_3302175133">
             <w:r>
               <w:rPr>
                 <w:webHidden/>
@@ -1513,7 +1513,7 @@
             </w:tabs>
             <w:rPr/>
           </w:pPr>
-          <w:hyperlink w:anchor="__RefHeading___Toc7813_1830364081">
+          <w:hyperlink w:anchor="__RefHeading___Toc7791_3302175133">
             <w:r>
               <w:rPr>
                 <w:webHidden/>
@@ -1535,7 +1535,7 @@
             </w:tabs>
             <w:rPr/>
           </w:pPr>
-          <w:hyperlink w:anchor="__RefHeading___Toc7815_1830364081">
+          <w:hyperlink w:anchor="__RefHeading___Toc7793_3302175133">
             <w:r>
               <w:rPr>
                 <w:webHidden/>
@@ -1557,7 +1557,7 @@
             </w:tabs>
             <w:rPr/>
           </w:pPr>
-          <w:hyperlink w:anchor="__RefHeading___Toc7817_1830364081">
+          <w:hyperlink w:anchor="__RefHeading___Toc7795_3302175133">
             <w:r>
               <w:rPr>
                 <w:webHidden/>
@@ -1579,7 +1579,7 @@
             </w:tabs>
             <w:rPr/>
           </w:pPr>
-          <w:hyperlink w:anchor="__RefHeading___Toc7819_1830364081">
+          <w:hyperlink w:anchor="__RefHeading___Toc7797_3302175133">
             <w:r>
               <w:rPr>
                 <w:webHidden/>
@@ -1601,7 +1601,7 @@
             </w:tabs>
             <w:rPr/>
           </w:pPr>
-          <w:hyperlink w:anchor="__RefHeading___Toc7821_1830364081">
+          <w:hyperlink w:anchor="__RefHeading___Toc7799_3302175133">
             <w:r>
               <w:rPr>
                 <w:webHidden/>
@@ -1623,7 +1623,7 @@
             </w:tabs>
             <w:rPr/>
           </w:pPr>
-          <w:hyperlink w:anchor="__RefHeading___Toc7823_1830364081">
+          <w:hyperlink w:anchor="__RefHeading___Toc7801_3302175133">
             <w:r>
               <w:rPr>
                 <w:webHidden/>
@@ -1645,7 +1645,7 @@
             </w:tabs>
             <w:rPr/>
           </w:pPr>
-          <w:hyperlink w:anchor="__RefHeading___Toc7825_1830364081">
+          <w:hyperlink w:anchor="__RefHeading___Toc7803_3302175133">
             <w:r>
               <w:rPr>
                 <w:webHidden/>
@@ -1667,7 +1667,7 @@
             </w:tabs>
             <w:rPr/>
           </w:pPr>
-          <w:hyperlink w:anchor="__RefHeading___Toc7827_1830364081">
+          <w:hyperlink w:anchor="__RefHeading___Toc7805_3302175133">
             <w:r>
               <w:rPr>
                 <w:webHidden/>
@@ -1689,7 +1689,7 @@
             </w:tabs>
             <w:rPr/>
           </w:pPr>
-          <w:hyperlink w:anchor="__RefHeading___Toc7829_1830364081">
+          <w:hyperlink w:anchor="__RefHeading___Toc7807_3302175133">
             <w:r>
               <w:rPr>
                 <w:webHidden/>
@@ -1711,7 +1711,7 @@
             </w:tabs>
             <w:rPr/>
           </w:pPr>
-          <w:hyperlink w:anchor="__RefHeading___Toc7831_1830364081">
+          <w:hyperlink w:anchor="__RefHeading___Toc7809_3302175133">
             <w:r>
               <w:rPr>
                 <w:webHidden/>
@@ -1733,7 +1733,7 @@
             </w:tabs>
             <w:rPr/>
           </w:pPr>
-          <w:hyperlink w:anchor="__RefHeading___Toc7833_1830364081">
+          <w:hyperlink w:anchor="__RefHeading___Toc7811_3302175133">
             <w:r>
               <w:rPr>
                 <w:webHidden/>
@@ -1755,7 +1755,7 @@
             </w:tabs>
             <w:rPr/>
           </w:pPr>
-          <w:hyperlink w:anchor="__RefHeading___Toc7835_1830364081">
+          <w:hyperlink w:anchor="__RefHeading___Toc7813_3302175133">
             <w:r>
               <w:rPr>
                 <w:webHidden/>
@@ -1777,7 +1777,7 @@
             </w:tabs>
             <w:rPr/>
           </w:pPr>
-          <w:hyperlink w:anchor="__RefHeading___Toc7837_1830364081">
+          <w:hyperlink w:anchor="__RefHeading___Toc7815_3302175133">
             <w:r>
               <w:rPr>
                 <w:webHidden/>
@@ -1799,7 +1799,7 @@
             </w:tabs>
             <w:rPr/>
           </w:pPr>
-          <w:hyperlink w:anchor="__RefHeading___Toc7839_1830364081">
+          <w:hyperlink w:anchor="__RefHeading___Toc7817_3302175133">
             <w:r>
               <w:rPr>
                 <w:webHidden/>
@@ -1821,7 +1821,7 @@
             </w:tabs>
             <w:rPr/>
           </w:pPr>
-          <w:hyperlink w:anchor="__RefHeading___Toc7841_1830364081">
+          <w:hyperlink w:anchor="__RefHeading___Toc7819_3302175133">
             <w:r>
               <w:rPr>
                 <w:webHidden/>
@@ -1843,7 +1843,7 @@
             </w:tabs>
             <w:rPr/>
           </w:pPr>
-          <w:hyperlink w:anchor="__RefHeading___Toc7843_1830364081">
+          <w:hyperlink w:anchor="__RefHeading___Toc7821_3302175133">
             <w:r>
               <w:rPr>
                 <w:webHidden/>
@@ -1865,7 +1865,7 @@
             </w:tabs>
             <w:rPr/>
           </w:pPr>
-          <w:hyperlink w:anchor="__RefHeading___Toc7845_1830364081">
+          <w:hyperlink w:anchor="__RefHeading___Toc7823_3302175133">
             <w:r>
               <w:rPr>
                 <w:webHidden/>
@@ -1887,7 +1887,7 @@
             </w:tabs>
             <w:rPr/>
           </w:pPr>
-          <w:hyperlink w:anchor="__RefHeading___Toc7847_1830364081">
+          <w:hyperlink w:anchor="__RefHeading___Toc7825_3302175133">
             <w:r>
               <w:rPr>
                 <w:webHidden/>
@@ -1935,7 +1935,7 @@
       <w:r>
         <w:br w:type="page"/>
       </w:r>
-      <w:bookmarkStart w:id="0" w:name="__RefHeading___Toc7749_1830364081"/>
+      <w:bookmarkStart w:id="0" w:name="__RefHeading___Toc7727_3302175133"/>
       <w:bookmarkStart w:id="1" w:name="_Toc48319687"/>
       <w:bookmarkStart w:id="2" w:name="_Toc11824118"/>
       <w:bookmarkEnd w:id="0"/>
@@ -2578,7 +2578,7 @@
           <w:spacing w:val="0"/>
         </w:rPr>
       </w:pPr>
-      <w:bookmarkStart w:id="4" w:name="__RefHeading___Toc7751_1830364081"/>
+      <w:bookmarkStart w:id="4" w:name="__RefHeading___Toc7729_3302175133"/>
       <w:bookmarkStart w:id="5" w:name="_Toc233203388"/>
       <w:bookmarkEnd w:id="4"/>
       <w:r>
@@ -4199,7 +4199,7 @@
         <w:pageBreakBefore w:val="false"/>
         <w:rPr/>
       </w:pPr>
-      <w:bookmarkStart w:id="6" w:name="__RefHeading___Toc7753_1830364081"/>
+      <w:bookmarkStart w:id="6" w:name="__RefHeading___Toc7731_3302175133"/>
       <w:bookmarkEnd w:id="6"/>
       <w:r>
         <w:rPr>
@@ -4216,7 +4216,7 @@
         <w:pStyle w:val="Heading2"/>
         <w:rPr/>
       </w:pPr>
-      <w:bookmarkStart w:id="7" w:name="__RefHeading___Toc7755_1830364081"/>
+      <w:bookmarkStart w:id="7" w:name="__RefHeading___Toc7733_3302175133"/>
       <w:bookmarkEnd w:id="7"/>
       <w:r>
         <w:rPr>
@@ -4362,7 +4362,7 @@
         <w:pStyle w:val="Heading2"/>
         <w:rPr/>
       </w:pPr>
-      <w:bookmarkStart w:id="8" w:name="__RefHeading___Toc7757_1830364081"/>
+      <w:bookmarkStart w:id="8" w:name="__RefHeading___Toc7735_3302175133"/>
       <w:bookmarkEnd w:id="8"/>
       <w:r>
         <w:rPr>
@@ -4604,7 +4604,7 @@
         <w:pStyle w:val="Heading2"/>
         <w:rPr/>
       </w:pPr>
-      <w:bookmarkStart w:id="9" w:name="__RefHeading___Toc7759_1830364081"/>
+      <w:bookmarkStart w:id="9" w:name="__RefHeading___Toc7737_3302175133"/>
       <w:bookmarkEnd w:id="9"/>
       <w:r>
         <w:rPr>
@@ -5574,7 +5574,7 @@
       <w:r>
         <w:br w:type="page"/>
       </w:r>
-      <w:bookmarkStart w:id="10" w:name="__RefHeading___Toc7761_1830364081"/>
+      <w:bookmarkStart w:id="10" w:name="__RefHeading___Toc7739_3302175133"/>
       <w:bookmarkEnd w:id="10"/>
       <w:r>
         <w:rPr>
@@ -5591,7 +5591,7 @@
         <w:pStyle w:val="Heading2"/>
         <w:rPr/>
       </w:pPr>
-      <w:bookmarkStart w:id="11" w:name="__RefHeading___Toc7763_1830364081"/>
+      <w:bookmarkStart w:id="11" w:name="__RefHeading___Toc7741_3302175133"/>
       <w:bookmarkEnd w:id="11"/>
       <w:r>
         <w:rPr>
@@ -7090,7 +7090,7 @@
         <w:pStyle w:val="Heading2"/>
         <w:rPr/>
       </w:pPr>
-      <w:bookmarkStart w:id="12" w:name="__RefHeading___Toc7765_1830364081"/>
+      <w:bookmarkStart w:id="12" w:name="__RefHeading___Toc7743_3302175133"/>
       <w:bookmarkEnd w:id="12"/>
       <w:r>
         <w:rPr>
@@ -8111,7 +8111,7 @@
         <w:pStyle w:val="Heading2"/>
         <w:rPr/>
       </w:pPr>
-      <w:bookmarkStart w:id="13" w:name="__RefHeading___Toc7767_1830364081"/>
+      <w:bookmarkStart w:id="13" w:name="__RefHeading___Toc7745_3302175133"/>
       <w:bookmarkEnd w:id="13"/>
       <w:r>
         <w:rPr>
@@ -9428,7 +9428,7 @@
         <w:pStyle w:val="Heading2"/>
         <w:rPr/>
       </w:pPr>
-      <w:bookmarkStart w:id="14" w:name="__RefHeading___Toc7769_1830364081"/>
+      <w:bookmarkStart w:id="14" w:name="__RefHeading___Toc7747_3302175133"/>
       <w:bookmarkEnd w:id="14"/>
       <w:r>
         <w:rPr>
@@ -10907,7 +10907,7 @@
         <w:pStyle w:val="Heading2"/>
         <w:rPr/>
       </w:pPr>
-      <w:bookmarkStart w:id="15" w:name="__RefHeading___Toc7771_1830364081"/>
+      <w:bookmarkStart w:id="15" w:name="__RefHeading___Toc7749_3302175133"/>
       <w:bookmarkEnd w:id="15"/>
       <w:r>
         <w:rPr>
@@ -12133,7 +12133,7 @@
         <w:pStyle w:val="Heading2"/>
         <w:rPr/>
       </w:pPr>
-      <w:bookmarkStart w:id="16" w:name="__RefHeading___Toc7773_1830364081"/>
+      <w:bookmarkStart w:id="16" w:name="__RefHeading___Toc7751_3302175133"/>
       <w:bookmarkEnd w:id="16"/>
       <w:r>
         <w:rPr>
@@ -12937,7 +12937,7 @@
         <w:pStyle w:val="Heading2"/>
         <w:rPr/>
       </w:pPr>
-      <w:bookmarkStart w:id="17" w:name="__RefHeading___Toc7775_1830364081"/>
+      <w:bookmarkStart w:id="17" w:name="__RefHeading___Toc7753_3302175133"/>
       <w:bookmarkEnd w:id="17"/>
       <w:r>
         <w:rPr>
@@ -14010,7 +14010,7 @@
         <w:pStyle w:val="Heading1"/>
         <w:rPr/>
       </w:pPr>
-      <w:bookmarkStart w:id="18" w:name="__RefHeading___Toc7777_1830364081"/>
+      <w:bookmarkStart w:id="18" w:name="__RefHeading___Toc7755_3302175133"/>
       <w:bookmarkEnd w:id="18"/>
       <w:r>
         <w:rPr>
@@ -14027,7 +14027,7 @@
         <w:pStyle w:val="Heading2"/>
         <w:rPr/>
       </w:pPr>
-      <w:bookmarkStart w:id="19" w:name="__RefHeading___Toc7779_1830364081"/>
+      <w:bookmarkStart w:id="19" w:name="__RefHeading___Toc7757_3302175133"/>
       <w:bookmarkEnd w:id="19"/>
       <w:r>
         <w:rPr>
@@ -14541,7 +14541,7 @@
         <w:pStyle w:val="Heading2"/>
         <w:rPr/>
       </w:pPr>
-      <w:bookmarkStart w:id="20" w:name="__RefHeading___Toc7781_1830364081"/>
+      <w:bookmarkStart w:id="20" w:name="__RefHeading___Toc7759_3302175133"/>
       <w:bookmarkEnd w:id="20"/>
       <w:r>
         <w:rPr>
@@ -15174,7 +15174,7 @@
         <w:pStyle w:val="Heading2"/>
         <w:rPr/>
       </w:pPr>
-      <w:bookmarkStart w:id="21" w:name="__RefHeading___Toc7783_1830364081"/>
+      <w:bookmarkStart w:id="21" w:name="__RefHeading___Toc7761_3302175133"/>
       <w:bookmarkEnd w:id="21"/>
       <w:r>
         <w:rPr>
@@ -15981,7 +15981,7 @@
         <w:pStyle w:val="Heading2"/>
         <w:rPr/>
       </w:pPr>
-      <w:bookmarkStart w:id="22" w:name="__RefHeading___Toc7785_1830364081"/>
+      <w:bookmarkStart w:id="22" w:name="__RefHeading___Toc7763_3302175133"/>
       <w:bookmarkEnd w:id="22"/>
       <w:r>
         <w:rPr>
@@ -16465,7 +16465,7 @@
         <w:pStyle w:val="Heading2"/>
         <w:rPr/>
       </w:pPr>
-      <w:bookmarkStart w:id="23" w:name="__RefHeading___Toc7787_1830364081"/>
+      <w:bookmarkStart w:id="23" w:name="__RefHeading___Toc7765_3302175133"/>
       <w:bookmarkEnd w:id="23"/>
       <w:r>
         <w:rPr>
@@ -17265,7 +17265,7 @@
         <w:pStyle w:val="Heading2"/>
         <w:rPr/>
       </w:pPr>
-      <w:bookmarkStart w:id="24" w:name="__RefHeading___Toc7789_1830364081"/>
+      <w:bookmarkStart w:id="24" w:name="__RefHeading___Toc7767_3302175133"/>
       <w:bookmarkEnd w:id="24"/>
       <w:r>
         <w:rPr>
@@ -19851,7 +19851,7 @@
         <w:pStyle w:val="Heading2"/>
         <w:rPr/>
       </w:pPr>
-      <w:bookmarkStart w:id="25" w:name="__RefHeading___Toc7791_1830364081"/>
+      <w:bookmarkStart w:id="25" w:name="__RefHeading___Toc7769_3302175133"/>
       <w:bookmarkEnd w:id="25"/>
       <w:r>
         <w:rPr>
@@ -20934,7 +20934,7 @@
         <w:pStyle w:val="Heading2"/>
         <w:rPr/>
       </w:pPr>
-      <w:bookmarkStart w:id="26" w:name="__RefHeading___Toc7793_1830364081"/>
+      <w:bookmarkStart w:id="26" w:name="__RefHeading___Toc7771_3302175133"/>
       <w:bookmarkEnd w:id="26"/>
       <w:r>
         <w:rPr>
@@ -21662,7 +21662,7 @@
         <w:pStyle w:val="Heading2"/>
         <w:rPr/>
       </w:pPr>
-      <w:bookmarkStart w:id="27" w:name="__RefHeading___Toc7795_1830364081"/>
+      <w:bookmarkStart w:id="27" w:name="__RefHeading___Toc7773_3302175133"/>
       <w:bookmarkEnd w:id="27"/>
       <w:r>
         <w:rPr>
@@ -22170,7 +22170,7 @@
       <w:r>
         <w:br w:type="page"/>
       </w:r>
-      <w:bookmarkStart w:id="28" w:name="__RefHeading___Toc7797_1830364081"/>
+      <w:bookmarkStart w:id="28" w:name="__RefHeading___Toc7775_3302175133"/>
       <w:bookmarkEnd w:id="28"/>
       <w:r>
         <w:rPr>
@@ -22187,7 +22187,7 @@
         <w:pStyle w:val="Heading2"/>
         <w:rPr/>
       </w:pPr>
-      <w:bookmarkStart w:id="29" w:name="__RefHeading___Toc7799_1830364081"/>
+      <w:bookmarkStart w:id="29" w:name="__RefHeading___Toc7777_3302175133"/>
       <w:bookmarkEnd w:id="29"/>
       <w:r>
         <w:rPr>
@@ -22250,7 +22250,7 @@
         <w:pStyle w:val="Heading2"/>
         <w:rPr/>
       </w:pPr>
-      <w:bookmarkStart w:id="30" w:name="__RefHeading___Toc7801_1830364081"/>
+      <w:bookmarkStart w:id="30" w:name="__RefHeading___Toc7779_3302175133"/>
       <w:bookmarkEnd w:id="30"/>
       <w:r>
         <w:rPr>
@@ -22787,7 +22787,7 @@
         <w:pStyle w:val="Heading2"/>
         <w:rPr/>
       </w:pPr>
-      <w:bookmarkStart w:id="31" w:name="__RefHeading___Toc7803_1830364081"/>
+      <w:bookmarkStart w:id="31" w:name="__RefHeading___Toc7781_3302175133"/>
       <w:bookmarkEnd w:id="31"/>
       <w:r>
         <w:rPr>
@@ -25197,7 +25197,7 @@
         <w:pStyle w:val="Heading2"/>
         <w:rPr/>
       </w:pPr>
-      <w:bookmarkStart w:id="32" w:name="__RefHeading___Toc7805_1830364081"/>
+      <w:bookmarkStart w:id="32" w:name="__RefHeading___Toc7783_3302175133"/>
       <w:bookmarkEnd w:id="32"/>
       <w:r>
         <w:rPr>
@@ -25298,7 +25298,7 @@
         <w:pStyle w:val="Heading2"/>
         <w:rPr/>
       </w:pPr>
-      <w:bookmarkStart w:id="33" w:name="__RefHeading___Toc7807_1830364081"/>
+      <w:bookmarkStart w:id="33" w:name="__RefHeading___Toc7785_3302175133"/>
       <w:bookmarkEnd w:id="33"/>
       <w:r>
         <w:rPr>
@@ -25505,7 +25505,7 @@
         <w:pStyle w:val="Heading1"/>
         <w:rPr/>
       </w:pPr>
-      <w:bookmarkStart w:id="34" w:name="__RefHeading___Toc7809_1830364081"/>
+      <w:bookmarkStart w:id="34" w:name="__RefHeading___Toc7787_3302175133"/>
       <w:bookmarkEnd w:id="34"/>
       <w:r>
         <w:rPr>
@@ -25522,7 +25522,7 @@
         <w:pStyle w:val="Heading2"/>
         <w:rPr/>
       </w:pPr>
-      <w:bookmarkStart w:id="35" w:name="__RefHeading___Toc7811_1830364081"/>
+      <w:bookmarkStart w:id="35" w:name="__RefHeading___Toc7789_3302175133"/>
       <w:bookmarkEnd w:id="35"/>
       <w:r>
         <w:rPr>
@@ -26098,7 +26098,7 @@
         <w:pStyle w:val="Heading2"/>
         <w:rPr/>
       </w:pPr>
-      <w:bookmarkStart w:id="36" w:name="__RefHeading___Toc7813_1830364081"/>
+      <w:bookmarkStart w:id="36" w:name="__RefHeading___Toc7791_3302175133"/>
       <w:bookmarkEnd w:id="36"/>
       <w:r>
         <w:rPr>
@@ -27256,7 +27256,7 @@
         <w:pStyle w:val="Heading2"/>
         <w:rPr/>
       </w:pPr>
-      <w:bookmarkStart w:id="37" w:name="__RefHeading___Toc7815_1830364081"/>
+      <w:bookmarkStart w:id="37" w:name="__RefHeading___Toc7793_3302175133"/>
       <w:bookmarkEnd w:id="37"/>
       <w:r>
         <w:rPr>
@@ -28520,7 +28520,7 @@
                 <w:szCs w:val="24"/>
                 <w:lang w:val="en-US" w:eastAsia="ja-JP" w:bidi="ar-SA"/>
               </w:rPr>
-              <w:t xml:space="preserve">Policy lists and </w:t>
+              <w:t>Policy lists filter on the source (</w:t>
             </w:r>
             <w:r>
               <w:rPr>
@@ -28542,19 +28542,7 @@
                 <w:szCs w:val="24"/>
                 <w:lang w:val="en-US" w:eastAsia="ja-JP" w:bidi="ar-SA"/>
               </w:rPr>
-              <w:t xml:space="preserve"> filter on the source. The Production report selects policies by inception date and does not filter on the source: a migrated policy with an inception date on or after the cutover date appears in it </w:t>
-            </w:r>
-            <w:r>
-              <w:rPr>
-                <w:rFonts w:eastAsia="Segoe UI" w:cs="Segoe UI" w:ascii="Segoe UI" w:hAnsi="Segoe UI"/>
-                <w:b/>
-                <w:color w:val="101820"/>
-                <w:kern w:val="0"/>
-                <w:sz w:val="18"/>
-                <w:szCs w:val="24"/>
-                <w:lang w:val="en-US" w:eastAsia="ja-JP" w:bidi="ar-SA"/>
-              </w:rPr>
-              <w:t>[to confirm whether a source filter is added to the production reports]</w:t>
+              <w:t>). The Production Register shows a Source column (Migrated or BrokerVerse), counts migrated policies in its summary and groups by source with the Report Criteria Source, so business written in BrokerVerse is reported apart from the migrated book. The executive dashboard leaves migrated policies out of premium written and new business</w:t>
             </w:r>
           </w:p>
         </w:tc>
@@ -28681,7 +28669,7 @@
         <w:pStyle w:val="Heading1"/>
         <w:rPr/>
       </w:pPr>
-      <w:bookmarkStart w:id="38" w:name="__RefHeading___Toc7817_1830364081"/>
+      <w:bookmarkStart w:id="38" w:name="__RefHeading___Toc7795_3302175133"/>
       <w:bookmarkEnd w:id="38"/>
       <w:r>
         <w:rPr>
@@ -28698,7 +28686,7 @@
         <w:pStyle w:val="Heading2"/>
         <w:rPr/>
       </w:pPr>
-      <w:bookmarkStart w:id="39" w:name="__RefHeading___Toc7819_1830364081"/>
+      <w:bookmarkStart w:id="39" w:name="__RefHeading___Toc7797_3302175133"/>
       <w:bookmarkEnd w:id="39"/>
       <w:r>
         <w:rPr>
@@ -29087,7 +29075,7 @@
         <w:pStyle w:val="Heading2"/>
         <w:rPr/>
       </w:pPr>
-      <w:bookmarkStart w:id="40" w:name="__RefHeading___Toc7821_1830364081"/>
+      <w:bookmarkStart w:id="40" w:name="__RefHeading___Toc7799_3302175133"/>
       <w:bookmarkEnd w:id="40"/>
       <w:r>
         <w:rPr>
@@ -29618,7 +29606,7 @@
       <w:r>
         <w:br w:type="page"/>
       </w:r>
-      <w:bookmarkStart w:id="41" w:name="__RefHeading___Toc7823_1830364081"/>
+      <w:bookmarkStart w:id="41" w:name="__RefHeading___Toc7801_3302175133"/>
       <w:bookmarkEnd w:id="41"/>
       <w:r>
         <w:rPr>
@@ -29635,7 +29623,7 @@
         <w:pStyle w:val="Heading2"/>
         <w:rPr/>
       </w:pPr>
-      <w:bookmarkStart w:id="42" w:name="__RefHeading___Toc7825_1830364081"/>
+      <w:bookmarkStart w:id="42" w:name="__RefHeading___Toc7803_3302175133"/>
       <w:bookmarkEnd w:id="42"/>
       <w:r>
         <w:rPr>
@@ -29700,7 +29688,7 @@
         <w:pStyle w:val="Heading2"/>
         <w:rPr/>
       </w:pPr>
-      <w:bookmarkStart w:id="43" w:name="__RefHeading___Toc7827_1830364081"/>
+      <w:bookmarkStart w:id="43" w:name="__RefHeading___Toc7805_3302175133"/>
       <w:bookmarkEnd w:id="43"/>
       <w:r>
         <w:rPr>
@@ -34099,7 +34087,7 @@
         <w:pStyle w:val="Heading2"/>
         <w:rPr/>
       </w:pPr>
-      <w:bookmarkStart w:id="44" w:name="__RefHeading___Toc7829_1830364081"/>
+      <w:bookmarkStart w:id="44" w:name="__RefHeading___Toc7807_3302175133"/>
       <w:bookmarkEnd w:id="44"/>
       <w:r>
         <w:rPr>
@@ -35879,7 +35867,7 @@
       <w:r>
         <w:br w:type="page"/>
       </w:r>
-      <w:bookmarkStart w:id="45" w:name="__RefHeading___Toc7831_1830364081"/>
+      <w:bookmarkStart w:id="45" w:name="__RefHeading___Toc7809_3302175133"/>
       <w:bookmarkEnd w:id="45"/>
       <w:r>
         <w:rPr>
@@ -35896,7 +35884,7 @@
         <w:pStyle w:val="Heading2"/>
         <w:rPr/>
       </w:pPr>
-      <w:bookmarkStart w:id="46" w:name="__RefHeading___Toc7833_1830364081"/>
+      <w:bookmarkStart w:id="46" w:name="__RefHeading___Toc7811_3302175133"/>
       <w:bookmarkEnd w:id="46"/>
       <w:r>
         <w:rPr>
@@ -42300,7 +42288,7 @@
         <w:pStyle w:val="Heading2"/>
         <w:rPr/>
       </w:pPr>
-      <w:bookmarkStart w:id="47" w:name="__RefHeading___Toc7835_1830364081"/>
+      <w:bookmarkStart w:id="47" w:name="__RefHeading___Toc7813_3302175133"/>
       <w:bookmarkEnd w:id="47"/>
       <w:r>
         <w:rPr>
@@ -43013,7 +43001,7 @@
         <w:pStyle w:val="Heading2"/>
         <w:rPr/>
       </w:pPr>
-      <w:bookmarkStart w:id="48" w:name="__RefHeading___Toc7837_1830364081"/>
+      <w:bookmarkStart w:id="48" w:name="__RefHeading___Toc7815_3302175133"/>
       <w:bookmarkEnd w:id="48"/>
       <w:r>
         <w:rPr>
@@ -43628,7 +43616,7 @@
         <w:pStyle w:val="Heading2"/>
         <w:rPr/>
       </w:pPr>
-      <w:bookmarkStart w:id="49" w:name="__RefHeading___Toc7839_1830364081"/>
+      <w:bookmarkStart w:id="49" w:name="__RefHeading___Toc7817_3302175133"/>
       <w:bookmarkEnd w:id="49"/>
       <w:r>
         <w:rPr>
@@ -44220,7 +44208,7 @@
         <w:pStyle w:val="Heading2"/>
         <w:rPr/>
       </w:pPr>
-      <w:bookmarkStart w:id="50" w:name="__RefHeading___Toc7841_1830364081"/>
+      <w:bookmarkStart w:id="50" w:name="__RefHeading___Toc7819_3302175133"/>
       <w:bookmarkEnd w:id="50"/>
       <w:r>
         <w:rPr>
@@ -44955,7 +44943,7 @@
         <w:pStyle w:val="Heading2"/>
         <w:rPr/>
       </w:pPr>
-      <w:bookmarkStart w:id="51" w:name="__RefHeading___Toc7843_1830364081"/>
+      <w:bookmarkStart w:id="51" w:name="__RefHeading___Toc7821_3302175133"/>
       <w:bookmarkEnd w:id="51"/>
       <w:r>
         <w:rPr>
@@ -45562,7 +45550,7 @@
       <w:r>
         <w:br w:type="page"/>
       </w:r>
-      <w:bookmarkStart w:id="52" w:name="__RefHeading___Toc7845_1830364081"/>
+      <w:bookmarkStart w:id="52" w:name="__RefHeading___Toc7823_3302175133"/>
       <w:bookmarkEnd w:id="52"/>
       <w:r>
         <w:rPr>
@@ -46400,120 +46388,6 @@
           </w:p>
         </w:tc>
       </w:tr>
-      <w:tr>
-        <w:trPr/>
-        <w:tc>
-          <w:tcPr>
-            <w:tcW w:w="906" w:type="dxa"/>
-            <w:tcBorders>
-              <w:top w:val="single" w:sz="4" w:space="0" w:color="BFC7D1"/>
-              <w:left w:val="single" w:sz="4" w:space="0" w:color="BFC7D1"/>
-              <w:bottom w:val="single" w:sz="4" w:space="0" w:color="BFC7D1"/>
-              <w:right w:val="single" w:sz="4" w:space="0" w:color="BFC7D1"/>
-            </w:tcBorders>
-          </w:tcPr>
-          <w:p>
-            <w:pPr>
-              <w:pStyle w:val="Normal"/>
-              <w:widowControl/>
-              <w:spacing w:lineRule="auto" w:line="240" w:before="0" w:after="20"/>
-              <w:jc w:val="left"/>
-              <w:rPr>
-                <w:rFonts w:ascii="Aptos" w:hAnsi="Aptos" w:eastAsia="ＭＳ 明朝" w:cs="Arial"/>
-                <w:kern w:val="0"/>
-                <w:sz w:val="24"/>
-                <w:szCs w:val="24"/>
-                <w:lang w:val="en-US" w:eastAsia="ja-JP" w:bidi="ar-SA"/>
-              </w:rPr>
-            </w:pPr>
-            <w:r>
-              <w:rPr>
-                <w:rFonts w:eastAsia="Segoe UI" w:cs="Segoe UI" w:ascii="Segoe UI" w:hAnsi="Segoe UI"/>
-                <w:color w:val="101820"/>
-                <w:kern w:val="0"/>
-                <w:sz w:val="18"/>
-                <w:szCs w:val="24"/>
-                <w:lang w:val="en-US" w:eastAsia="ja-JP" w:bidi="ar-SA"/>
-              </w:rPr>
-              <w:t>7</w:t>
-            </w:r>
-          </w:p>
-        </w:tc>
-        <w:tc>
-          <w:tcPr>
-            <w:tcW w:w="4527" w:type="dxa"/>
-            <w:tcBorders>
-              <w:top w:val="single" w:sz="4" w:space="0" w:color="BFC7D1"/>
-              <w:left w:val="single" w:sz="4" w:space="0" w:color="BFC7D1"/>
-              <w:bottom w:val="single" w:sz="4" w:space="0" w:color="BFC7D1"/>
-              <w:right w:val="single" w:sz="4" w:space="0" w:color="BFC7D1"/>
-            </w:tcBorders>
-          </w:tcPr>
-          <w:p>
-            <w:pPr>
-              <w:pStyle w:val="Normal"/>
-              <w:widowControl/>
-              <w:spacing w:lineRule="auto" w:line="240" w:before="0" w:after="20"/>
-              <w:jc w:val="left"/>
-              <w:rPr>
-                <w:rFonts w:ascii="Aptos" w:hAnsi="Aptos" w:eastAsia="ＭＳ 明朝" w:cs="Arial"/>
-                <w:kern w:val="0"/>
-                <w:sz w:val="24"/>
-                <w:szCs w:val="24"/>
-                <w:lang w:val="en-US" w:eastAsia="ja-JP" w:bidi="ar-SA"/>
-              </w:rPr>
-            </w:pPr>
-            <w:r>
-              <w:rPr>
-                <w:rFonts w:eastAsia="Segoe UI" w:cs="Segoe UI" w:ascii="Segoe UI" w:hAnsi="Segoe UI"/>
-                <w:color w:val="101820"/>
-                <w:kern w:val="0"/>
-                <w:sz w:val="18"/>
-                <w:szCs w:val="24"/>
-                <w:lang w:val="en-US" w:eastAsia="ja-JP" w:bidi="ar-SA"/>
-              </w:rPr>
-              <w:t>A source filter on the production reports for migrated policies with an inception date on or after the cutover date</w:t>
-            </w:r>
-          </w:p>
-        </w:tc>
-        <w:tc>
-          <w:tcPr>
-            <w:tcW w:w="3581" w:type="dxa"/>
-            <w:tcBorders>
-              <w:top w:val="single" w:sz="4" w:space="0" w:color="BFC7D1"/>
-              <w:left w:val="single" w:sz="4" w:space="0" w:color="BFC7D1"/>
-              <w:bottom w:val="single" w:sz="4" w:space="0" w:color="BFC7D1"/>
-              <w:right w:val="single" w:sz="4" w:space="0" w:color="BFC7D1"/>
-            </w:tcBorders>
-          </w:tcPr>
-          <w:p>
-            <w:pPr>
-              <w:pStyle w:val="Normal"/>
-              <w:widowControl/>
-              <w:spacing w:lineRule="auto" w:line="240" w:before="0" w:after="20"/>
-              <w:jc w:val="left"/>
-              <w:rPr>
-                <w:rFonts w:ascii="Aptos" w:hAnsi="Aptos" w:eastAsia="ＭＳ 明朝" w:cs="Arial"/>
-                <w:kern w:val="0"/>
-                <w:sz w:val="24"/>
-                <w:szCs w:val="24"/>
-                <w:lang w:val="en-US" w:eastAsia="ja-JP" w:bidi="ar-SA"/>
-              </w:rPr>
-            </w:pPr>
-            <w:r>
-              <w:rPr>
-                <w:rFonts w:eastAsia="Segoe UI" w:cs="Segoe UI" w:ascii="Segoe UI" w:hAnsi="Segoe UI"/>
-                <w:color w:val="101820"/>
-                <w:kern w:val="0"/>
-                <w:sz w:val="18"/>
-                <w:szCs w:val="24"/>
-                <w:lang w:val="en-US" w:eastAsia="ja-JP" w:bidi="ar-SA"/>
-              </w:rPr>
-              <w:t>iorta TechNXT product owner</w:t>
-            </w:r>
-          </w:p>
-        </w:tc>
-      </w:tr>
     </w:tbl>
     <w:p>
       <w:pPr>
@@ -46537,7 +46411,7 @@
       <w:r>
         <w:br w:type="page"/>
       </w:r>
-      <w:bookmarkStart w:id="53" w:name="__RefHeading___Toc7847_1830364081"/>
+      <w:bookmarkStart w:id="53" w:name="__RefHeading___Toc7825_3302175133"/>
       <w:bookmarkStart w:id="54" w:name="_Toc233203395"/>
       <w:bookmarkEnd w:id="53"/>
       <w:r>

</xml_diff>

<commit_message>
User manual and rollout guide rebuilt after the workbench fixes
</commit_message>
<xml_diff>
--- a/docs/package/04_Onboarding_and_Go_Live/BrokerVerse_Environment_Strategy_and_Production_Rollout.docx
+++ b/docs/package/04_Onboarding_and_Go_Live/BrokerVerse_Environment_Strategy_and_Production_Rollout.docx
@@ -789,7 +789,7 @@
             </w:rPr>
             <w:fldChar w:fldCharType="separate"/>
           </w:r>
-          <w:hyperlink w:anchor="__RefHeading___Toc7727_3302175133">
+          <w:hyperlink w:anchor="__RefHeading___Toc7727_2106653968">
             <w:r>
               <w:rPr>
                 <w:webHidden/>
@@ -824,7 +824,7 @@
             </w:tabs>
             <w:rPr/>
           </w:pPr>
-          <w:hyperlink w:anchor="__RefHeading___Toc7729_3302175133">
+          <w:hyperlink w:anchor="__RefHeading___Toc7729_2106653968">
             <w:r>
               <w:rPr>
                 <w:webHidden/>
@@ -853,7 +853,7 @@
             </w:tabs>
             <w:rPr/>
           </w:pPr>
-          <w:hyperlink w:anchor="__RefHeading___Toc7731_3302175133">
+          <w:hyperlink w:anchor="__RefHeading___Toc7731_2106653968">
             <w:r>
               <w:rPr>
                 <w:webHidden/>
@@ -875,7 +875,7 @@
             </w:tabs>
             <w:rPr/>
           </w:pPr>
-          <w:hyperlink w:anchor="__RefHeading___Toc7733_3302175133">
+          <w:hyperlink w:anchor="__RefHeading___Toc7733_2106653968">
             <w:r>
               <w:rPr>
                 <w:webHidden/>
@@ -897,7 +897,7 @@
             </w:tabs>
             <w:rPr/>
           </w:pPr>
-          <w:hyperlink w:anchor="__RefHeading___Toc7735_3302175133">
+          <w:hyperlink w:anchor="__RefHeading___Toc7735_2106653968">
             <w:r>
               <w:rPr>
                 <w:webHidden/>
@@ -919,7 +919,7 @@
             </w:tabs>
             <w:rPr/>
           </w:pPr>
-          <w:hyperlink w:anchor="__RefHeading___Toc7737_3302175133">
+          <w:hyperlink w:anchor="__RefHeading___Toc7737_2106653968">
             <w:r>
               <w:rPr>
                 <w:webHidden/>
@@ -941,7 +941,7 @@
             </w:tabs>
             <w:rPr/>
           </w:pPr>
-          <w:hyperlink w:anchor="__RefHeading___Toc7739_3302175133">
+          <w:hyperlink w:anchor="__RefHeading___Toc7739_2106653968">
             <w:r>
               <w:rPr>
                 <w:webHidden/>
@@ -963,7 +963,7 @@
             </w:tabs>
             <w:rPr/>
           </w:pPr>
-          <w:hyperlink w:anchor="__RefHeading___Toc7741_3302175133">
+          <w:hyperlink w:anchor="__RefHeading___Toc7741_2106653968">
             <w:r>
               <w:rPr>
                 <w:webHidden/>
@@ -985,7 +985,7 @@
             </w:tabs>
             <w:rPr/>
           </w:pPr>
-          <w:hyperlink w:anchor="__RefHeading___Toc7743_3302175133">
+          <w:hyperlink w:anchor="__RefHeading___Toc7743_2106653968">
             <w:r>
               <w:rPr>
                 <w:webHidden/>
@@ -1007,7 +1007,7 @@
             </w:tabs>
             <w:rPr/>
           </w:pPr>
-          <w:hyperlink w:anchor="__RefHeading___Toc7745_3302175133">
+          <w:hyperlink w:anchor="__RefHeading___Toc7745_2106653968">
             <w:r>
               <w:rPr>
                 <w:webHidden/>
@@ -1029,7 +1029,7 @@
             </w:tabs>
             <w:rPr/>
           </w:pPr>
-          <w:hyperlink w:anchor="__RefHeading___Toc7747_3302175133">
+          <w:hyperlink w:anchor="__RefHeading___Toc7747_2106653968">
             <w:r>
               <w:rPr>
                 <w:webHidden/>
@@ -1051,7 +1051,7 @@
             </w:tabs>
             <w:rPr/>
           </w:pPr>
-          <w:hyperlink w:anchor="__RefHeading___Toc7749_3302175133">
+          <w:hyperlink w:anchor="__RefHeading___Toc7749_2106653968">
             <w:r>
               <w:rPr>
                 <w:webHidden/>
@@ -1073,7 +1073,7 @@
             </w:tabs>
             <w:rPr/>
           </w:pPr>
-          <w:hyperlink w:anchor="__RefHeading___Toc7751_3302175133">
+          <w:hyperlink w:anchor="__RefHeading___Toc7751_2106653968">
             <w:r>
               <w:rPr>
                 <w:webHidden/>
@@ -1095,7 +1095,7 @@
             </w:tabs>
             <w:rPr/>
           </w:pPr>
-          <w:hyperlink w:anchor="__RefHeading___Toc7753_3302175133">
+          <w:hyperlink w:anchor="__RefHeading___Toc7753_2106653968">
             <w:r>
               <w:rPr>
                 <w:webHidden/>
@@ -1117,7 +1117,7 @@
             </w:tabs>
             <w:rPr/>
           </w:pPr>
-          <w:hyperlink w:anchor="__RefHeading___Toc7755_3302175133">
+          <w:hyperlink w:anchor="__RefHeading___Toc7755_2106653968">
             <w:r>
               <w:rPr>
                 <w:webHidden/>
@@ -1139,7 +1139,7 @@
             </w:tabs>
             <w:rPr/>
           </w:pPr>
-          <w:hyperlink w:anchor="__RefHeading___Toc7757_3302175133">
+          <w:hyperlink w:anchor="__RefHeading___Toc7757_2106653968">
             <w:r>
               <w:rPr>
                 <w:webHidden/>
@@ -1161,7 +1161,7 @@
             </w:tabs>
             <w:rPr/>
           </w:pPr>
-          <w:hyperlink w:anchor="__RefHeading___Toc7759_3302175133">
+          <w:hyperlink w:anchor="__RefHeading___Toc7759_2106653968">
             <w:r>
               <w:rPr>
                 <w:webHidden/>
@@ -1183,7 +1183,7 @@
             </w:tabs>
             <w:rPr/>
           </w:pPr>
-          <w:hyperlink w:anchor="__RefHeading___Toc7761_3302175133">
+          <w:hyperlink w:anchor="__RefHeading___Toc7761_2106653968">
             <w:r>
               <w:rPr>
                 <w:webHidden/>
@@ -1205,7 +1205,7 @@
             </w:tabs>
             <w:rPr/>
           </w:pPr>
-          <w:hyperlink w:anchor="__RefHeading___Toc7763_3302175133">
+          <w:hyperlink w:anchor="__RefHeading___Toc7763_2106653968">
             <w:r>
               <w:rPr>
                 <w:webHidden/>
@@ -1227,7 +1227,7 @@
             </w:tabs>
             <w:rPr/>
           </w:pPr>
-          <w:hyperlink w:anchor="__RefHeading___Toc7765_3302175133">
+          <w:hyperlink w:anchor="__RefHeading___Toc7765_2106653968">
             <w:r>
               <w:rPr>
                 <w:webHidden/>
@@ -1249,7 +1249,7 @@
             </w:tabs>
             <w:rPr/>
           </w:pPr>
-          <w:hyperlink w:anchor="__RefHeading___Toc7767_3302175133">
+          <w:hyperlink w:anchor="__RefHeading___Toc7767_2106653968">
             <w:r>
               <w:rPr>
                 <w:webHidden/>
@@ -1271,7 +1271,7 @@
             </w:tabs>
             <w:rPr/>
           </w:pPr>
-          <w:hyperlink w:anchor="__RefHeading___Toc7769_3302175133">
+          <w:hyperlink w:anchor="__RefHeading___Toc7769_2106653968">
             <w:r>
               <w:rPr>
                 <w:webHidden/>
@@ -1293,7 +1293,7 @@
             </w:tabs>
             <w:rPr/>
           </w:pPr>
-          <w:hyperlink w:anchor="__RefHeading___Toc7771_3302175133">
+          <w:hyperlink w:anchor="__RefHeading___Toc7771_2106653968">
             <w:r>
               <w:rPr>
                 <w:webHidden/>
@@ -1315,7 +1315,7 @@
             </w:tabs>
             <w:rPr/>
           </w:pPr>
-          <w:hyperlink w:anchor="__RefHeading___Toc7773_3302175133">
+          <w:hyperlink w:anchor="__RefHeading___Toc7773_2106653968">
             <w:r>
               <w:rPr>
                 <w:webHidden/>
@@ -1337,7 +1337,7 @@
             </w:tabs>
             <w:rPr/>
           </w:pPr>
-          <w:hyperlink w:anchor="__RefHeading___Toc7775_3302175133">
+          <w:hyperlink w:anchor="__RefHeading___Toc7775_2106653968">
             <w:r>
               <w:rPr>
                 <w:webHidden/>
@@ -1359,7 +1359,7 @@
             </w:tabs>
             <w:rPr/>
           </w:pPr>
-          <w:hyperlink w:anchor="__RefHeading___Toc7777_3302175133">
+          <w:hyperlink w:anchor="__RefHeading___Toc7777_2106653968">
             <w:r>
               <w:rPr>
                 <w:webHidden/>
@@ -1381,7 +1381,7 @@
             </w:tabs>
             <w:rPr/>
           </w:pPr>
-          <w:hyperlink w:anchor="__RefHeading___Toc7779_3302175133">
+          <w:hyperlink w:anchor="__RefHeading___Toc7779_2106653968">
             <w:r>
               <w:rPr>
                 <w:webHidden/>
@@ -1403,7 +1403,7 @@
             </w:tabs>
             <w:rPr/>
           </w:pPr>
-          <w:hyperlink w:anchor="__RefHeading___Toc7781_3302175133">
+          <w:hyperlink w:anchor="__RefHeading___Toc7781_2106653968">
             <w:r>
               <w:rPr>
                 <w:webHidden/>
@@ -1425,7 +1425,7 @@
             </w:tabs>
             <w:rPr/>
           </w:pPr>
-          <w:hyperlink w:anchor="__RefHeading___Toc7783_3302175133">
+          <w:hyperlink w:anchor="__RefHeading___Toc7783_2106653968">
             <w:r>
               <w:rPr>
                 <w:webHidden/>
@@ -1447,7 +1447,7 @@
             </w:tabs>
             <w:rPr/>
           </w:pPr>
-          <w:hyperlink w:anchor="__RefHeading___Toc7785_3302175133">
+          <w:hyperlink w:anchor="__RefHeading___Toc7785_2106653968">
             <w:r>
               <w:rPr>
                 <w:webHidden/>
@@ -1469,7 +1469,7 @@
             </w:tabs>
             <w:rPr/>
           </w:pPr>
-          <w:hyperlink w:anchor="__RefHeading___Toc7787_3302175133">
+          <w:hyperlink w:anchor="__RefHeading___Toc7787_2106653968">
             <w:r>
               <w:rPr>
                 <w:webHidden/>
@@ -1491,7 +1491,7 @@
             </w:tabs>
             <w:rPr/>
           </w:pPr>
-          <w:hyperlink w:anchor="__RefHeading___Toc7789_3302175133">
+          <w:hyperlink w:anchor="__RefHeading___Toc7789_2106653968">
             <w:r>
               <w:rPr>
                 <w:webHidden/>
@@ -1513,7 +1513,7 @@
             </w:tabs>
             <w:rPr/>
           </w:pPr>
-          <w:hyperlink w:anchor="__RefHeading___Toc7791_3302175133">
+          <w:hyperlink w:anchor="__RefHeading___Toc7791_2106653968">
             <w:r>
               <w:rPr>
                 <w:webHidden/>
@@ -1535,7 +1535,7 @@
             </w:tabs>
             <w:rPr/>
           </w:pPr>
-          <w:hyperlink w:anchor="__RefHeading___Toc7793_3302175133">
+          <w:hyperlink w:anchor="__RefHeading___Toc7793_2106653968">
             <w:r>
               <w:rPr>
                 <w:webHidden/>
@@ -1557,7 +1557,7 @@
             </w:tabs>
             <w:rPr/>
           </w:pPr>
-          <w:hyperlink w:anchor="__RefHeading___Toc7795_3302175133">
+          <w:hyperlink w:anchor="__RefHeading___Toc7795_2106653968">
             <w:r>
               <w:rPr>
                 <w:webHidden/>
@@ -1579,7 +1579,7 @@
             </w:tabs>
             <w:rPr/>
           </w:pPr>
-          <w:hyperlink w:anchor="__RefHeading___Toc7797_3302175133">
+          <w:hyperlink w:anchor="__RefHeading___Toc7797_2106653968">
             <w:r>
               <w:rPr>
                 <w:webHidden/>
@@ -1601,7 +1601,7 @@
             </w:tabs>
             <w:rPr/>
           </w:pPr>
-          <w:hyperlink w:anchor="__RefHeading___Toc7799_3302175133">
+          <w:hyperlink w:anchor="__RefHeading___Toc7799_2106653968">
             <w:r>
               <w:rPr>
                 <w:webHidden/>
@@ -1623,7 +1623,7 @@
             </w:tabs>
             <w:rPr/>
           </w:pPr>
-          <w:hyperlink w:anchor="__RefHeading___Toc7801_3302175133">
+          <w:hyperlink w:anchor="__RefHeading___Toc7801_2106653968">
             <w:r>
               <w:rPr>
                 <w:webHidden/>
@@ -1645,7 +1645,7 @@
             </w:tabs>
             <w:rPr/>
           </w:pPr>
-          <w:hyperlink w:anchor="__RefHeading___Toc7803_3302175133">
+          <w:hyperlink w:anchor="__RefHeading___Toc7803_2106653968">
             <w:r>
               <w:rPr>
                 <w:webHidden/>
@@ -1667,7 +1667,7 @@
             </w:tabs>
             <w:rPr/>
           </w:pPr>
-          <w:hyperlink w:anchor="__RefHeading___Toc7805_3302175133">
+          <w:hyperlink w:anchor="__RefHeading___Toc7805_2106653968">
             <w:r>
               <w:rPr>
                 <w:webHidden/>
@@ -1689,7 +1689,7 @@
             </w:tabs>
             <w:rPr/>
           </w:pPr>
-          <w:hyperlink w:anchor="__RefHeading___Toc7807_3302175133">
+          <w:hyperlink w:anchor="__RefHeading___Toc7807_2106653968">
             <w:r>
               <w:rPr>
                 <w:webHidden/>
@@ -1711,7 +1711,7 @@
             </w:tabs>
             <w:rPr/>
           </w:pPr>
-          <w:hyperlink w:anchor="__RefHeading___Toc7809_3302175133">
+          <w:hyperlink w:anchor="__RefHeading___Toc7809_2106653968">
             <w:r>
               <w:rPr>
                 <w:webHidden/>
@@ -1733,7 +1733,7 @@
             </w:tabs>
             <w:rPr/>
           </w:pPr>
-          <w:hyperlink w:anchor="__RefHeading___Toc7811_3302175133">
+          <w:hyperlink w:anchor="__RefHeading___Toc7811_2106653968">
             <w:r>
               <w:rPr>
                 <w:webHidden/>
@@ -1755,7 +1755,7 @@
             </w:tabs>
             <w:rPr/>
           </w:pPr>
-          <w:hyperlink w:anchor="__RefHeading___Toc7813_3302175133">
+          <w:hyperlink w:anchor="__RefHeading___Toc7813_2106653968">
             <w:r>
               <w:rPr>
                 <w:webHidden/>
@@ -1777,7 +1777,7 @@
             </w:tabs>
             <w:rPr/>
           </w:pPr>
-          <w:hyperlink w:anchor="__RefHeading___Toc7815_3302175133">
+          <w:hyperlink w:anchor="__RefHeading___Toc7815_2106653968">
             <w:r>
               <w:rPr>
                 <w:webHidden/>
@@ -1799,7 +1799,7 @@
             </w:tabs>
             <w:rPr/>
           </w:pPr>
-          <w:hyperlink w:anchor="__RefHeading___Toc7817_3302175133">
+          <w:hyperlink w:anchor="__RefHeading___Toc7817_2106653968">
             <w:r>
               <w:rPr>
                 <w:webHidden/>
@@ -1821,7 +1821,7 @@
             </w:tabs>
             <w:rPr/>
           </w:pPr>
-          <w:hyperlink w:anchor="__RefHeading___Toc7819_3302175133">
+          <w:hyperlink w:anchor="__RefHeading___Toc7819_2106653968">
             <w:r>
               <w:rPr>
                 <w:webHidden/>
@@ -1843,7 +1843,7 @@
             </w:tabs>
             <w:rPr/>
           </w:pPr>
-          <w:hyperlink w:anchor="__RefHeading___Toc7821_3302175133">
+          <w:hyperlink w:anchor="__RefHeading___Toc7821_2106653968">
             <w:r>
               <w:rPr>
                 <w:webHidden/>
@@ -1865,7 +1865,7 @@
             </w:tabs>
             <w:rPr/>
           </w:pPr>
-          <w:hyperlink w:anchor="__RefHeading___Toc7823_3302175133">
+          <w:hyperlink w:anchor="__RefHeading___Toc7823_2106653968">
             <w:r>
               <w:rPr>
                 <w:webHidden/>
@@ -1887,7 +1887,7 @@
             </w:tabs>
             <w:rPr/>
           </w:pPr>
-          <w:hyperlink w:anchor="__RefHeading___Toc7825_3302175133">
+          <w:hyperlink w:anchor="__RefHeading___Toc7825_2106653968">
             <w:r>
               <w:rPr>
                 <w:webHidden/>
@@ -1935,7 +1935,7 @@
       <w:r>
         <w:br w:type="page"/>
       </w:r>
-      <w:bookmarkStart w:id="0" w:name="__RefHeading___Toc7727_3302175133"/>
+      <w:bookmarkStart w:id="0" w:name="__RefHeading___Toc7727_2106653968"/>
       <w:bookmarkStart w:id="1" w:name="_Toc48319687"/>
       <w:bookmarkStart w:id="2" w:name="_Toc11824118"/>
       <w:bookmarkEnd w:id="0"/>
@@ -2578,7 +2578,7 @@
           <w:spacing w:val="0"/>
         </w:rPr>
       </w:pPr>
-      <w:bookmarkStart w:id="4" w:name="__RefHeading___Toc7729_3302175133"/>
+      <w:bookmarkStart w:id="4" w:name="__RefHeading___Toc7729_2106653968"/>
       <w:bookmarkStart w:id="5" w:name="_Toc233203388"/>
       <w:bookmarkEnd w:id="4"/>
       <w:r>
@@ -4199,7 +4199,7 @@
         <w:pageBreakBefore w:val="false"/>
         <w:rPr/>
       </w:pPr>
-      <w:bookmarkStart w:id="6" w:name="__RefHeading___Toc7731_3302175133"/>
+      <w:bookmarkStart w:id="6" w:name="__RefHeading___Toc7731_2106653968"/>
       <w:bookmarkEnd w:id="6"/>
       <w:r>
         <w:rPr>
@@ -4216,7 +4216,7 @@
         <w:pStyle w:val="Heading2"/>
         <w:rPr/>
       </w:pPr>
-      <w:bookmarkStart w:id="7" w:name="__RefHeading___Toc7733_3302175133"/>
+      <w:bookmarkStart w:id="7" w:name="__RefHeading___Toc7733_2106653968"/>
       <w:bookmarkEnd w:id="7"/>
       <w:r>
         <w:rPr>
@@ -4362,7 +4362,7 @@
         <w:pStyle w:val="Heading2"/>
         <w:rPr/>
       </w:pPr>
-      <w:bookmarkStart w:id="8" w:name="__RefHeading___Toc7735_3302175133"/>
+      <w:bookmarkStart w:id="8" w:name="__RefHeading___Toc7735_2106653968"/>
       <w:bookmarkEnd w:id="8"/>
       <w:r>
         <w:rPr>
@@ -4604,7 +4604,7 @@
         <w:pStyle w:val="Heading2"/>
         <w:rPr/>
       </w:pPr>
-      <w:bookmarkStart w:id="9" w:name="__RefHeading___Toc7737_3302175133"/>
+      <w:bookmarkStart w:id="9" w:name="__RefHeading___Toc7737_2106653968"/>
       <w:bookmarkEnd w:id="9"/>
       <w:r>
         <w:rPr>
@@ -5574,7 +5574,7 @@
       <w:r>
         <w:br w:type="page"/>
       </w:r>
-      <w:bookmarkStart w:id="10" w:name="__RefHeading___Toc7739_3302175133"/>
+      <w:bookmarkStart w:id="10" w:name="__RefHeading___Toc7739_2106653968"/>
       <w:bookmarkEnd w:id="10"/>
       <w:r>
         <w:rPr>
@@ -5591,7 +5591,7 @@
         <w:pStyle w:val="Heading2"/>
         <w:rPr/>
       </w:pPr>
-      <w:bookmarkStart w:id="11" w:name="__RefHeading___Toc7741_3302175133"/>
+      <w:bookmarkStart w:id="11" w:name="__RefHeading___Toc7741_2106653968"/>
       <w:bookmarkEnd w:id="11"/>
       <w:r>
         <w:rPr>
@@ -7090,7 +7090,7 @@
         <w:pStyle w:val="Heading2"/>
         <w:rPr/>
       </w:pPr>
-      <w:bookmarkStart w:id="12" w:name="__RefHeading___Toc7743_3302175133"/>
+      <w:bookmarkStart w:id="12" w:name="__RefHeading___Toc7743_2106653968"/>
       <w:bookmarkEnd w:id="12"/>
       <w:r>
         <w:rPr>
@@ -8111,7 +8111,7 @@
         <w:pStyle w:val="Heading2"/>
         <w:rPr/>
       </w:pPr>
-      <w:bookmarkStart w:id="13" w:name="__RefHeading___Toc7745_3302175133"/>
+      <w:bookmarkStart w:id="13" w:name="__RefHeading___Toc7745_2106653968"/>
       <w:bookmarkEnd w:id="13"/>
       <w:r>
         <w:rPr>
@@ -9428,7 +9428,7 @@
         <w:pStyle w:val="Heading2"/>
         <w:rPr/>
       </w:pPr>
-      <w:bookmarkStart w:id="14" w:name="__RefHeading___Toc7747_3302175133"/>
+      <w:bookmarkStart w:id="14" w:name="__RefHeading___Toc7747_2106653968"/>
       <w:bookmarkEnd w:id="14"/>
       <w:r>
         <w:rPr>
@@ -10907,7 +10907,7 @@
         <w:pStyle w:val="Heading2"/>
         <w:rPr/>
       </w:pPr>
-      <w:bookmarkStart w:id="15" w:name="__RefHeading___Toc7749_3302175133"/>
+      <w:bookmarkStart w:id="15" w:name="__RefHeading___Toc7749_2106653968"/>
       <w:bookmarkEnd w:id="15"/>
       <w:r>
         <w:rPr>
@@ -12133,7 +12133,7 @@
         <w:pStyle w:val="Heading2"/>
         <w:rPr/>
       </w:pPr>
-      <w:bookmarkStart w:id="16" w:name="__RefHeading___Toc7751_3302175133"/>
+      <w:bookmarkStart w:id="16" w:name="__RefHeading___Toc7751_2106653968"/>
       <w:bookmarkEnd w:id="16"/>
       <w:r>
         <w:rPr>
@@ -12937,7 +12937,7 @@
         <w:pStyle w:val="Heading2"/>
         <w:rPr/>
       </w:pPr>
-      <w:bookmarkStart w:id="17" w:name="__RefHeading___Toc7753_3302175133"/>
+      <w:bookmarkStart w:id="17" w:name="__RefHeading___Toc7753_2106653968"/>
       <w:bookmarkEnd w:id="17"/>
       <w:r>
         <w:rPr>
@@ -14010,7 +14010,7 @@
         <w:pStyle w:val="Heading1"/>
         <w:rPr/>
       </w:pPr>
-      <w:bookmarkStart w:id="18" w:name="__RefHeading___Toc7755_3302175133"/>
+      <w:bookmarkStart w:id="18" w:name="__RefHeading___Toc7755_2106653968"/>
       <w:bookmarkEnd w:id="18"/>
       <w:r>
         <w:rPr>
@@ -14027,7 +14027,7 @@
         <w:pStyle w:val="Heading2"/>
         <w:rPr/>
       </w:pPr>
-      <w:bookmarkStart w:id="19" w:name="__RefHeading___Toc7757_3302175133"/>
+      <w:bookmarkStart w:id="19" w:name="__RefHeading___Toc7757_2106653968"/>
       <w:bookmarkEnd w:id="19"/>
       <w:r>
         <w:rPr>
@@ -14541,7 +14541,7 @@
         <w:pStyle w:val="Heading2"/>
         <w:rPr/>
       </w:pPr>
-      <w:bookmarkStart w:id="20" w:name="__RefHeading___Toc7759_3302175133"/>
+      <w:bookmarkStart w:id="20" w:name="__RefHeading___Toc7759_2106653968"/>
       <w:bookmarkEnd w:id="20"/>
       <w:r>
         <w:rPr>
@@ -15174,7 +15174,7 @@
         <w:pStyle w:val="Heading2"/>
         <w:rPr/>
       </w:pPr>
-      <w:bookmarkStart w:id="21" w:name="__RefHeading___Toc7761_3302175133"/>
+      <w:bookmarkStart w:id="21" w:name="__RefHeading___Toc7761_2106653968"/>
       <w:bookmarkEnd w:id="21"/>
       <w:r>
         <w:rPr>
@@ -15981,7 +15981,7 @@
         <w:pStyle w:val="Heading2"/>
         <w:rPr/>
       </w:pPr>
-      <w:bookmarkStart w:id="22" w:name="__RefHeading___Toc7763_3302175133"/>
+      <w:bookmarkStart w:id="22" w:name="__RefHeading___Toc7763_2106653968"/>
       <w:bookmarkEnd w:id="22"/>
       <w:r>
         <w:rPr>
@@ -16465,7 +16465,7 @@
         <w:pStyle w:val="Heading2"/>
         <w:rPr/>
       </w:pPr>
-      <w:bookmarkStart w:id="23" w:name="__RefHeading___Toc7765_3302175133"/>
+      <w:bookmarkStart w:id="23" w:name="__RefHeading___Toc7765_2106653968"/>
       <w:bookmarkEnd w:id="23"/>
       <w:r>
         <w:rPr>
@@ -17265,7 +17265,7 @@
         <w:pStyle w:val="Heading2"/>
         <w:rPr/>
       </w:pPr>
-      <w:bookmarkStart w:id="24" w:name="__RefHeading___Toc7767_3302175133"/>
+      <w:bookmarkStart w:id="24" w:name="__RefHeading___Toc7767_2106653968"/>
       <w:bookmarkEnd w:id="24"/>
       <w:r>
         <w:rPr>
@@ -19851,7 +19851,7 @@
         <w:pStyle w:val="Heading2"/>
         <w:rPr/>
       </w:pPr>
-      <w:bookmarkStart w:id="25" w:name="__RefHeading___Toc7769_3302175133"/>
+      <w:bookmarkStart w:id="25" w:name="__RefHeading___Toc7769_2106653968"/>
       <w:bookmarkEnd w:id="25"/>
       <w:r>
         <w:rPr>
@@ -20934,7 +20934,7 @@
         <w:pStyle w:val="Heading2"/>
         <w:rPr/>
       </w:pPr>
-      <w:bookmarkStart w:id="26" w:name="__RefHeading___Toc7771_3302175133"/>
+      <w:bookmarkStart w:id="26" w:name="__RefHeading___Toc7771_2106653968"/>
       <w:bookmarkEnd w:id="26"/>
       <w:r>
         <w:rPr>
@@ -21662,7 +21662,7 @@
         <w:pStyle w:val="Heading2"/>
         <w:rPr/>
       </w:pPr>
-      <w:bookmarkStart w:id="27" w:name="__RefHeading___Toc7773_3302175133"/>
+      <w:bookmarkStart w:id="27" w:name="__RefHeading___Toc7773_2106653968"/>
       <w:bookmarkEnd w:id="27"/>
       <w:r>
         <w:rPr>
@@ -22170,7 +22170,7 @@
       <w:r>
         <w:br w:type="page"/>
       </w:r>
-      <w:bookmarkStart w:id="28" w:name="__RefHeading___Toc7775_3302175133"/>
+      <w:bookmarkStart w:id="28" w:name="__RefHeading___Toc7775_2106653968"/>
       <w:bookmarkEnd w:id="28"/>
       <w:r>
         <w:rPr>
@@ -22187,7 +22187,7 @@
         <w:pStyle w:val="Heading2"/>
         <w:rPr/>
       </w:pPr>
-      <w:bookmarkStart w:id="29" w:name="__RefHeading___Toc7777_3302175133"/>
+      <w:bookmarkStart w:id="29" w:name="__RefHeading___Toc7777_2106653968"/>
       <w:bookmarkEnd w:id="29"/>
       <w:r>
         <w:rPr>
@@ -22250,7 +22250,7 @@
         <w:pStyle w:val="Heading2"/>
         <w:rPr/>
       </w:pPr>
-      <w:bookmarkStart w:id="30" w:name="__RefHeading___Toc7779_3302175133"/>
+      <w:bookmarkStart w:id="30" w:name="__RefHeading___Toc7779_2106653968"/>
       <w:bookmarkEnd w:id="30"/>
       <w:r>
         <w:rPr>
@@ -22787,7 +22787,7 @@
         <w:pStyle w:val="Heading2"/>
         <w:rPr/>
       </w:pPr>
-      <w:bookmarkStart w:id="31" w:name="__RefHeading___Toc7781_3302175133"/>
+      <w:bookmarkStart w:id="31" w:name="__RefHeading___Toc7781_2106653968"/>
       <w:bookmarkEnd w:id="31"/>
       <w:r>
         <w:rPr>
@@ -25197,7 +25197,7 @@
         <w:pStyle w:val="Heading2"/>
         <w:rPr/>
       </w:pPr>
-      <w:bookmarkStart w:id="32" w:name="__RefHeading___Toc7783_3302175133"/>
+      <w:bookmarkStart w:id="32" w:name="__RefHeading___Toc7783_2106653968"/>
       <w:bookmarkEnd w:id="32"/>
       <w:r>
         <w:rPr>
@@ -25298,7 +25298,7 @@
         <w:pStyle w:val="Heading2"/>
         <w:rPr/>
       </w:pPr>
-      <w:bookmarkStart w:id="33" w:name="__RefHeading___Toc7785_3302175133"/>
+      <w:bookmarkStart w:id="33" w:name="__RefHeading___Toc7785_2106653968"/>
       <w:bookmarkEnd w:id="33"/>
       <w:r>
         <w:rPr>
@@ -25505,7 +25505,7 @@
         <w:pStyle w:val="Heading1"/>
         <w:rPr/>
       </w:pPr>
-      <w:bookmarkStart w:id="34" w:name="__RefHeading___Toc7787_3302175133"/>
+      <w:bookmarkStart w:id="34" w:name="__RefHeading___Toc7787_2106653968"/>
       <w:bookmarkEnd w:id="34"/>
       <w:r>
         <w:rPr>
@@ -25522,7 +25522,7 @@
         <w:pStyle w:val="Heading2"/>
         <w:rPr/>
       </w:pPr>
-      <w:bookmarkStart w:id="35" w:name="__RefHeading___Toc7789_3302175133"/>
+      <w:bookmarkStart w:id="35" w:name="__RefHeading___Toc7789_2106653968"/>
       <w:bookmarkEnd w:id="35"/>
       <w:r>
         <w:rPr>
@@ -26098,7 +26098,7 @@
         <w:pStyle w:val="Heading2"/>
         <w:rPr/>
       </w:pPr>
-      <w:bookmarkStart w:id="36" w:name="__RefHeading___Toc7791_3302175133"/>
+      <w:bookmarkStart w:id="36" w:name="__RefHeading___Toc7791_2106653968"/>
       <w:bookmarkEnd w:id="36"/>
       <w:r>
         <w:rPr>
@@ -27256,7 +27256,7 @@
         <w:pStyle w:val="Heading2"/>
         <w:rPr/>
       </w:pPr>
-      <w:bookmarkStart w:id="37" w:name="__RefHeading___Toc7793_3302175133"/>
+      <w:bookmarkStart w:id="37" w:name="__RefHeading___Toc7793_2106653968"/>
       <w:bookmarkEnd w:id="37"/>
       <w:r>
         <w:rPr>
@@ -27860,7 +27860,7 @@
                 <w:szCs w:val="24"/>
                 <w:lang w:val="en-US" w:eastAsia="ja-JP" w:bidi="ar-SA"/>
               </w:rPr>
-              <w:t>The TB of the old system at the close of the day before the cutover date (cutover minus one day). Debits equal credits; the sheet loads all or nothing; loading again replaces the earlier load. The fiscal year must have no journal posted before the cutover</w:t>
+              <w:t>The TB of the old system at the close of the day before the cutover date (cutover minus one day). Debits equal credits; the sheet loads all or nothing (the rows in error show their errors, the others are held, one message for the sheet); a row with no debit or credit is ignored; loading again replaces the earlier load. The fiscal year must have no journal posted before the cutover</w:t>
             </w:r>
           </w:p>
         </w:tc>
@@ -28669,7 +28669,7 @@
         <w:pStyle w:val="Heading1"/>
         <w:rPr/>
       </w:pPr>
-      <w:bookmarkStart w:id="38" w:name="__RefHeading___Toc7795_3302175133"/>
+      <w:bookmarkStart w:id="38" w:name="__RefHeading___Toc7795_2106653968"/>
       <w:bookmarkEnd w:id="38"/>
       <w:r>
         <w:rPr>
@@ -28686,7 +28686,7 @@
         <w:pStyle w:val="Heading2"/>
         <w:rPr/>
       </w:pPr>
-      <w:bookmarkStart w:id="39" w:name="__RefHeading___Toc7797_3302175133"/>
+      <w:bookmarkStart w:id="39" w:name="__RefHeading___Toc7797_2106653968"/>
       <w:bookmarkEnd w:id="39"/>
       <w:r>
         <w:rPr>
@@ -28948,7 +28948,7 @@
           <w:color w:val="101820"/>
           <w:sz w:val="21"/>
         </w:rPr>
-        <w:t>masters, configuration, users and settings are kept; transaction document series restart at their start number; the TB is empty and every period is open again; the reset is recorded in the audit trail;</w:t>
+        <w:t>masters, configuration, users and settings are kept; transaction document series restart at the next number the Numbering sheet set (else their start number); the TB is empty and every period is open again; the reset is recorded in the audit trail;</w:t>
       </w:r>
     </w:p>
     <w:p>
@@ -29075,7 +29075,7 @@
         <w:pStyle w:val="Heading2"/>
         <w:rPr/>
       </w:pPr>
-      <w:bookmarkStart w:id="40" w:name="__RefHeading___Toc7799_3302175133"/>
+      <w:bookmarkStart w:id="40" w:name="__RefHeading___Toc7799_2106653968"/>
       <w:bookmarkEnd w:id="40"/>
       <w:r>
         <w:rPr>
@@ -29606,7 +29606,7 @@
       <w:r>
         <w:br w:type="page"/>
       </w:r>
-      <w:bookmarkStart w:id="41" w:name="__RefHeading___Toc7801_3302175133"/>
+      <w:bookmarkStart w:id="41" w:name="__RefHeading___Toc7801_2106653968"/>
       <w:bookmarkEnd w:id="41"/>
       <w:r>
         <w:rPr>
@@ -29623,7 +29623,7 @@
         <w:pStyle w:val="Heading2"/>
         <w:rPr/>
       </w:pPr>
-      <w:bookmarkStart w:id="42" w:name="__RefHeading___Toc7803_3302175133"/>
+      <w:bookmarkStart w:id="42" w:name="__RefHeading___Toc7803_2106653968"/>
       <w:bookmarkEnd w:id="42"/>
       <w:r>
         <w:rPr>
@@ -29688,7 +29688,7 @@
         <w:pStyle w:val="Heading2"/>
         <w:rPr/>
       </w:pPr>
-      <w:bookmarkStart w:id="43" w:name="__RefHeading___Toc7805_3302175133"/>
+      <w:bookmarkStart w:id="43" w:name="__RefHeading___Toc7805_2106653968"/>
       <w:bookmarkEnd w:id="43"/>
       <w:r>
         <w:rPr>
@@ -34087,7 +34087,7 @@
         <w:pStyle w:val="Heading2"/>
         <w:rPr/>
       </w:pPr>
-      <w:bookmarkStart w:id="44" w:name="__RefHeading___Toc7807_3302175133"/>
+      <w:bookmarkStart w:id="44" w:name="__RefHeading___Toc7807_2106653968"/>
       <w:bookmarkEnd w:id="44"/>
       <w:r>
         <w:rPr>
@@ -35867,7 +35867,7 @@
       <w:r>
         <w:br w:type="page"/>
       </w:r>
-      <w:bookmarkStart w:id="45" w:name="__RefHeading___Toc7809_3302175133"/>
+      <w:bookmarkStart w:id="45" w:name="__RefHeading___Toc7809_2106653968"/>
       <w:bookmarkEnd w:id="45"/>
       <w:r>
         <w:rPr>
@@ -35884,7 +35884,7 @@
         <w:pStyle w:val="Heading2"/>
         <w:rPr/>
       </w:pPr>
-      <w:bookmarkStart w:id="46" w:name="__RefHeading___Toc7811_3302175133"/>
+      <w:bookmarkStart w:id="46" w:name="__RefHeading___Toc7811_2106653968"/>
       <w:bookmarkEnd w:id="46"/>
       <w:r>
         <w:rPr>
@@ -42288,7 +42288,7 @@
         <w:pStyle w:val="Heading2"/>
         <w:rPr/>
       </w:pPr>
-      <w:bookmarkStart w:id="47" w:name="__RefHeading___Toc7813_3302175133"/>
+      <w:bookmarkStart w:id="47" w:name="__RefHeading___Toc7813_2106653968"/>
       <w:bookmarkEnd w:id="47"/>
       <w:r>
         <w:rPr>
@@ -43001,7 +43001,7 @@
         <w:pStyle w:val="Heading2"/>
         <w:rPr/>
       </w:pPr>
-      <w:bookmarkStart w:id="48" w:name="__RefHeading___Toc7815_3302175133"/>
+      <w:bookmarkStart w:id="48" w:name="__RefHeading___Toc7815_2106653968"/>
       <w:bookmarkEnd w:id="48"/>
       <w:r>
         <w:rPr>
@@ -43616,7 +43616,7 @@
         <w:pStyle w:val="Heading2"/>
         <w:rPr/>
       </w:pPr>
-      <w:bookmarkStart w:id="49" w:name="__RefHeading___Toc7817_3302175133"/>
+      <w:bookmarkStart w:id="49" w:name="__RefHeading___Toc7817_2106653968"/>
       <w:bookmarkEnd w:id="49"/>
       <w:r>
         <w:rPr>
@@ -44208,7 +44208,7 @@
         <w:pStyle w:val="Heading2"/>
         <w:rPr/>
       </w:pPr>
-      <w:bookmarkStart w:id="50" w:name="__RefHeading___Toc7819_3302175133"/>
+      <w:bookmarkStart w:id="50" w:name="__RefHeading___Toc7819_2106653968"/>
       <w:bookmarkEnd w:id="50"/>
       <w:r>
         <w:rPr>
@@ -44943,7 +44943,7 @@
         <w:pStyle w:val="Heading2"/>
         <w:rPr/>
       </w:pPr>
-      <w:bookmarkStart w:id="51" w:name="__RefHeading___Toc7821_3302175133"/>
+      <w:bookmarkStart w:id="51" w:name="__RefHeading___Toc7821_2106653968"/>
       <w:bookmarkEnd w:id="51"/>
       <w:r>
         <w:rPr>
@@ -45550,7 +45550,7 @@
       <w:r>
         <w:br w:type="page"/>
       </w:r>
-      <w:bookmarkStart w:id="52" w:name="__RefHeading___Toc7823_3302175133"/>
+      <w:bookmarkStart w:id="52" w:name="__RefHeading___Toc7823_2106653968"/>
       <w:bookmarkEnd w:id="52"/>
       <w:r>
         <w:rPr>
@@ -46411,7 +46411,7 @@
       <w:r>
         <w:br w:type="page"/>
       </w:r>
-      <w:bookmarkStart w:id="53" w:name="__RefHeading___Toc7825_3302175133"/>
+      <w:bookmarkStart w:id="53" w:name="__RefHeading___Toc7825_2106653968"/>
       <w:bookmarkStart w:id="54" w:name="_Toc233203395"/>
       <w:bookmarkEnd w:id="53"/>
       <w:r>

</xml_diff>